<commit_message>
v1.154.60: docs: AI for Records & Archives framework workbook - expanded descriptive text, workbook, diagrams, cornerstone article, LinkedIn pack
</commit_message>
<xml_diff>
--- a/docs/ai-rm-framework/Industry-AI-RAM-Framework.docx
+++ b/docs/ai-rm-framework/Industry-AI-RAM-Framework.docx
@@ -787,6 +787,9 @@
         </w:rPr>
         <w:t xml:space="preserve"> Legal obligations, file-plan, retention authorities, data-classification policy, authorised roles.</w:t>
       </w:r>
+      <w:r>
+        <w:t xml:space="preserve">  This layer is the source of truth for what the law and the institution require: it defines the obligations, the file-plan and retention rules, and who is permitted to do what, and every layer above must honour those constraints.</w:t>
+      </w:r>
     </w:p>
     <w:p>
       <w:pPr>
@@ -815,6 +818,9 @@
         </w:rPr>
         <w:t xml:space="preserve"> AI Governance Committee, risk register, review procedures, model registry and performance gates.</w:t>
       </w:r>
+      <w:r>
+        <w:t xml:space="preserve">  This layer is where people hold the AI to account: the committee approves models for production, the risk register tracks what could go wrong, and the model registry and performance gates keep an unproven model away from live records.</w:t>
+      </w:r>
     </w:p>
     <w:p>
       <w:pPr>
@@ -843,6 +849,9 @@
         </w:rPr>
         <w:t xml:space="preserve"> Crawlers, snapshot store (file hash + URI), OCR pipeline, token-level provenance capture, ingest manifest and tick-box for uploader-triggered ingestion.</w:t>
       </w:r>
+      <w:r>
+        <w:t xml:space="preserve">  This layer is the controlled front door: it brings content in without altering the originals and stamps each step with provenance, so everything that follows can be traced back to a verifiable source.</w:t>
+      </w:r>
     </w:p>
     <w:p>
       <w:pPr>
@@ -869,7 +878,10 @@
         <w:rPr>
           <w:lang w:val="en-ZA"/>
         </w:rPr>
-        <w:t xml:space="preserve"> NER/entity extraction, classification models, sensitivity detectors, deduplication and de-duplication engines, embeddings/semantic search indices and model-serving infrastructure.</w:t>
+        <w:t xml:space="preserve"> NER/entity extraction, classification models, sensitivity detectors, deduplication engines, embeddings/semantic search indices and model-serving infrastructure.</w:t>
+      </w:r>
+      <w:r>
+        <w:t xml:space="preserve">  This layer does the machine work of understanding the content - recognising entities, classifying records, flagging sensitive material and powering search - and is deliberately swappable, so models can be upgraded without disturbing the layers around it.</w:t>
       </w:r>
     </w:p>
     <w:p>
@@ -899,6 +911,9 @@
         </w:rPr>
         <w:t>ECM / EDRMS integration, retention rule enforcement (human-acknowledged), secure archival transfer, ACLs.</w:t>
       </w:r>
+      <w:r>
+        <w:t xml:space="preserve">  This layer turns decisions into action inside the systems of record: it enforces retention rules (only ever with a human's acknowledgement), moves material into secure archival custody, and controls who can see what.</w:t>
+      </w:r>
     </w:p>
     <w:p>
       <w:pPr>
@@ -926,6 +941,9 @@
           <w:lang w:val="en-ZA"/>
         </w:rPr>
         <w:t xml:space="preserve"> Provenance timeline, diff viewer, review queues, bulk review tooling and audit exports.</w:t>
+      </w:r>
+      <w:r>
+        <w:t xml:space="preserve">  This layer is where people actually work with the system: it makes the AI's reasoning visible, lets curators review and correct at scale, and produces the audit evidence that regulators and auditors ask for.</w:t>
       </w:r>
     </w:p>
     <w:p>
@@ -1010,7 +1028,7 @@
         <w:rPr>
           <w:lang w:val="en-ZA"/>
         </w:rPr>
-        <w:t>Read-only, least-privilege crawler with incremental scanning.</w:t>
+        <w:t>Read-only, least-privilege crawler with incremental scanning: it reads from the source stores without ever modifying them, runs under the narrowest access rights that still let it see the content, and on each pass picks up only what is new or changed, so repeated scans stay fast and never disturb the originals.</w:t>
       </w:r>
     </w:p>
     <w:p>
@@ -1030,7 +1048,7 @@
         <w:rPr>
           <w:lang w:val="en-ZA"/>
         </w:rPr>
-        <w:t>Ingest queue with uploader tick-box (queue_for_ingest).</w:t>
+        <w:t>An ingest queue fed by an uploader tick-box (queue_for_ingest): a person or an automated watcher flags an item for processing and it joins an orderly, auditable queue rather than being processed silently, giving a single clear point of entry into the pipeline.</w:t>
       </w:r>
     </w:p>
     <w:p>
@@ -1050,7 +1068,7 @@
         <w:rPr>
           <w:lang w:val="en-ZA"/>
         </w:rPr>
-        <w:t>Snapshot store: file hash + object-store URI for reproducibility.</w:t>
+        <w:t>Snapshot store recording each file's cryptographic hash alongside its object-store location (URI): the hash fixes exactly which bytes were processed, so any later result can be reproduced and verified, and the URI retrieves that exact version again.</w:t>
       </w:r>
     </w:p>
     <w:p>
@@ -1090,7 +1108,7 @@
         <w:rPr>
           <w:lang w:val="en-ZA"/>
         </w:rPr>
-        <w:t>Layout-aware OCR with page/offset provenance.</w:t>
+        <w:t>Layout-aware optical character recognition (OCR) that understands page structure (columns, tables, headings) instead of reading text as one flat stream, and records where each extracted character sits (page and offset) so every word can be traced back to its exact place on the original page.</w:t>
       </w:r>
     </w:p>
     <w:p>
@@ -1110,7 +1128,7 @@
         <w:rPr>
           <w:lang w:val="en-ZA"/>
         </w:rPr>
-        <w:t>Store raw OCR outputs as first-class artefacts; do not overwrite originals.</w:t>
+        <w:t>Raw OCR output is kept as a first-class artefact in its own right and is never written back over the source: the original is preserved untouched while the machine-read text sits beside it as reviewable, re-runnable evidence.</w:t>
       </w:r>
     </w:p>
     <w:p>
@@ -1150,7 +1168,7 @@
         <w:rPr>
           <w:lang w:val="en-ZA"/>
         </w:rPr>
-        <w:t>Organisationally-trained classifiers and NER tuned to local file plans and terminology.</w:t>
+        <w:t>Classifiers and named-entity recognition (NER) trained on the organisation's own material and tuned to its file plan and house terminology, so categories and entities reflect how this institution actually describes its records rather than a generic, off-the-shelf vocabulary.</w:t>
       </w:r>
     </w:p>
     <w:p>
@@ -1170,7 +1188,7 @@
         <w:rPr>
           <w:lang w:val="en-ZA"/>
         </w:rPr>
-        <w:t>Confidence thresholds drive review/workflow paths.</w:t>
+        <w:t>Configurable confidence thresholds decide each item's path automatically: a high-confidence result can flow straight through, while anything below the threshold or flagged high-risk is routed to a human, so effort is spent where the model is least sure.</w:t>
       </w:r>
     </w:p>
     <w:p>
@@ -1190,7 +1208,7 @@
         <w:rPr>
           <w:lang w:val="en-ZA"/>
         </w:rPr>
-        <w:t>Model registry records training data provenance, evaluation sets, and metrics.</w:t>
+        <w:t>A model registry records, for every model in use, where its training data came from, which evaluation sets it was tested against, and how it scored, so any decision the AI influenced can be tied back to a specific, documented model version.</w:t>
       </w:r>
     </w:p>
     <w:p>
@@ -1230,7 +1248,7 @@
         <w:rPr>
           <w:lang w:val="en-ZA"/>
         </w:rPr>
-        <w:t>PII detectors (name/ID/health/financial markers) early in pipeline.</w:t>
+        <w:t>Detectors for personal and special-category data (names, identity numbers, health and financial markers) run early in the pipeline, so sensitive content is recognised before it is indexed or surfaced, not after.</w:t>
       </w:r>
     </w:p>
     <w:p>
@@ -1250,7 +1268,7 @@
         <w:rPr>
           <w:lang w:val="en-ZA"/>
         </w:rPr>
-        <w:t>Policy-driven redaction/limited-indexing options.</w:t>
+        <w:t>Policy then drives what happens to that sensitive content: it can be redacted, indexed only in a limited way, or withheld entirely, with the choice governed by configurable rules rather than left to each operator.</w:t>
       </w:r>
     </w:p>
     <w:p>
@@ -1290,7 +1308,7 @@
         <w:rPr>
           <w:lang w:val="en-ZA"/>
         </w:rPr>
-        <w:t>Append-only provenance events (processing_jobs, review events, policy decisions) stored in JSONB for audit and replay.</w:t>
+        <w:t>Provenance is captured as append-only events (processing jobs, review actions, policy decisions) that are never edited or deleted, stored as structured JSON so the full history of any record can be audited and replayed step by step.</w:t>
       </w:r>
     </w:p>
     <w:p>
@@ -1330,7 +1348,7 @@
         <w:rPr>
           <w:lang w:val="en-ZA"/>
         </w:rPr>
-        <w:t>Low confidence/high-risk items surfaced for curator review.</w:t>
+        <w:t>Items the model is unsure about, or that carry higher risk, are surfaced to a curator rather than actioned automatically, keeping a qualified human in control of the decisions that matter most.</w:t>
       </w:r>
     </w:p>
     <w:p>
@@ -1350,7 +1368,7 @@
         <w:rPr>
           <w:lang w:val="en-ZA"/>
         </w:rPr>
-        <w:t>Diff viewer showing raw -&gt; canonical text and reviewer edits.</w:t>
+        <w:t>A diff viewer shows the raw machine output beside the cleaned, canonical text and any edits a reviewer made, so corrections stay transparent and the reasoning behind the final version is visible.</w:t>
       </w:r>
     </w:p>
     <w:p>
@@ -1450,8 +1468,7 @@
         <w:rPr>
           <w:lang w:val="en-ZA"/>
         </w:rPr>
-        <w:lastRenderedPageBreak/>
-        <w:t>Integration adapters: AtoM, SharePoint/Teams, M-Files, OpenText, existing ECM/EDRMS connectors.</w:t>
+        <w:t>Integration adapters connect the pipeline to the systems records already live in (AtoM, SharePoint/Teams, M-Files, OpenText, and other existing ECM/EDRMS connectors), so it augments the current estate rather than replacing it.</w:t>
       </w:r>
     </w:p>
     <w:p>
@@ -1961,7 +1978,7 @@
         <w:rPr>
           <w:lang w:val="en-ZA"/>
         </w:rPr>
-        <w:t>Classification precision and recall per file-plan category.</w:t>
+        <w:t>Classification precision and recall, reported per file-plan category: precision is how often a category is assigned correctly, recall is how much of each category is actually found, broken down so weak categories are visible rather than hidden in an average.</w:t>
       </w:r>
     </w:p>
     <w:p>
@@ -1981,7 +1998,7 @@
         <w:rPr>
           <w:lang w:val="en-ZA"/>
         </w:rPr>
-        <w:t>Time-to-discovery (median reduction pre/post pilot).</w:t>
+        <w:t>Time-to-discovery, the median time to locate a record, compared before and after the pilot to show the real-world speed gain in plain terms.</w:t>
       </w:r>
     </w:p>
     <w:p>
@@ -2001,7 +2018,7 @@
         <w:rPr>
           <w:lang w:val="en-ZA"/>
         </w:rPr>
-        <w:t>Access-to-information response SLA achievement rate.</w:t>
+        <w:t>Access-to-information response SLA achievement rate: the share of requests answered within their statutory deadline, the headline measure of legal responsiveness.</w:t>
       </w:r>
     </w:p>
     <w:p>
@@ -2021,7 +2038,7 @@
         <w:rPr>
           <w:lang w:val="en-ZA"/>
         </w:rPr>
-        <w:t>Review backlog size and reviewer throughput.</w:t>
+        <w:t>Review backlog size and reviewer throughput: how much is waiting for human review and how quickly reviewers clear it, so the human-in-the-loop step is resourced before it becomes a bottleneck.</w:t>
       </w:r>
     </w:p>
     <w:p>
@@ -2041,7 +2058,7 @@
         <w:rPr>
           <w:lang w:val="en-ZA"/>
         </w:rPr>
-        <w:t>Model drift indicators (distributional shifts) and retraining frequency.</w:t>
+        <w:t>Model drift indicators (shifts over time in the data the model sees) and retraining frequency, so accuracy is actively monitored rather than assumed to hold.</w:t>
       </w:r>
     </w:p>
     <w:p>
@@ -6302,7 +6319,7 @@
         <w:rPr>
           <w:lang w:val="en-ZA"/>
         </w:rPr>
-        <w:t>Provide a technical design that maps to the Heratio layered architecture.</w:t>
+        <w:t>Provide a technical design that maps to the framework's layered architecture.</w:t>
       </w:r>
     </w:p>
     <w:p>

</xml_diff>